<commit_message>
update site - 2026-05-30 22:36
</commit_message>
<xml_diff>
--- a/pubs.docx
+++ b/pubs.docx
@@ -1286,15 +1286,21 @@
       </w:r>
       <w:proofErr w:type="spellEnd"/>
       <w:r>
-        <w:t>. Biological Conservation, 2026: p. 111823. [</w:t>
-      </w:r>
-      <w:proofErr w:type="spellStart"/>
-      <w:r>
-        <w:t>doi</w:t>
-      </w:r>
-      <w:proofErr w:type="spellEnd"/>
-      <w:r>
-        <w:t xml:space="preserve">] (https://doi.org/10.1016/j.biocon.2026.111823) </w:t>
+        <w:t xml:space="preserve">. Biological Conservation, 2026: p. 111823. </w:t>
+      </w:r>
+      <w:r>
+        <w:t>[</w:t>
+      </w:r>
+      <w:proofErr w:type="spellStart"/>
+      <w:r>
+        <w:t>doi</w:t>
+      </w:r>
+      <w:proofErr w:type="spellEnd"/>
+      <w:r>
+        <w:t>]</w:t>
+      </w:r>
+      <w:r>
+        <w:t xml:space="preserve">(https://doi.org/10.1016/j.biocon.2026.111823) </w:t>
       </w:r>
     </w:p>
     <w:p>
@@ -1303,15 +1309,21 @@
       </w:r>
       <w:r>
         <w:tab/>
-        <w:t>Teitelbaum, C.S., D.J. Prosser, J.T. Ackerman, … **Y, Si**, … S.E.W. De La Cruz, Waterfowl Move Less in Heterogeneous and Human-Populated Landscapes, With Implications for Spread of Avian Influenza Viruses. Ecology Letters, 2026. 29(1): p. e70265. [</w:t>
-      </w:r>
-      <w:proofErr w:type="spellStart"/>
-      <w:r>
-        <w:t>doi</w:t>
-      </w:r>
-      <w:proofErr w:type="spellEnd"/>
-      <w:r>
-        <w:t xml:space="preserve">] (https://doi.org/10.1111/ele.70265) </w:t>
+        <w:t xml:space="preserve">Teitelbaum, C.S., D.J. Prosser, J.T. Ackerman, … **Y, Si**, … S.E.W. De La Cruz, Waterfowl Move Less in Heterogeneous and Human-Populated Landscapes, With Implications for Spread of Avian Influenza Viruses. Ecology Letters, 2026. 29(1): p. e70265. </w:t>
+      </w:r>
+      <w:r>
+        <w:t>[</w:t>
+      </w:r>
+      <w:proofErr w:type="spellStart"/>
+      <w:r>
+        <w:t>doi</w:t>
+      </w:r>
+      <w:proofErr w:type="spellEnd"/>
+      <w:r>
+        <w:t>]</w:t>
+      </w:r>
+      <w:r>
+        <w:t xml:space="preserve">(https://doi.org/10.1111/ele.70265) </w:t>
       </w:r>
     </w:p>
     <w:p>
@@ -1320,15 +1332,21 @@
       </w:r>
       <w:r>
         <w:tab/>
-        <w:t>Gent, J., P.M. van Bodegom, and **Y, Si**, A conceptual framework for the temporal dynamics of spatial environmental heterogeneity–biodiversity relationships. Frontiers in Ecology and Evolution, 2026. Volume 14 - 2026. [</w:t>
-      </w:r>
-      <w:proofErr w:type="spellStart"/>
-      <w:r>
-        <w:t>doi</w:t>
-      </w:r>
-      <w:proofErr w:type="spellEnd"/>
-      <w:r>
-        <w:t xml:space="preserve">] (https://doi.org/10.3389/fevo.2026.1731666) </w:t>
+        <w:t xml:space="preserve">Gent, J., P.M. van Bodegom, and **Y, Si**, A conceptual framework for the temporal dynamics of spatial environmental heterogeneity–biodiversity relationships. Frontiers in Ecology and Evolution, 2026. Volume 14 - 2026. </w:t>
+      </w:r>
+      <w:r>
+        <w:t>[</w:t>
+      </w:r>
+      <w:proofErr w:type="spellStart"/>
+      <w:r>
+        <w:t>doi</w:t>
+      </w:r>
+      <w:proofErr w:type="spellEnd"/>
+      <w:r>
+        <w:t>]</w:t>
+      </w:r>
+      <w:r>
+        <w:t xml:space="preserve">(https://doi.org/10.3389/fevo.2026.1731666) </w:t>
       </w:r>
     </w:p>
     <w:p/>
@@ -1344,15 +1362,21 @@
       </w:r>
       <w:r>
         <w:tab/>
-        <w:t>Yin, S., C. Zhang, C.S. Teitelbaum, **Y, Si**, G. Zhang, X. Wang, D. Mao, Z.Y.X. Huang, W. Frederik de Boer, J. Takekawa, D.J. Prosser, and X. Xiao, Landscape changes elevate the risk of avian influenza virus diversification and emergence in the East Asian–Australasian Flyway. Proceedings of the National Academy of Sciences, 2025. 122(34): p. e2503427122. [</w:t>
-      </w:r>
-      <w:proofErr w:type="spellStart"/>
-      <w:r>
-        <w:t>doi</w:t>
-      </w:r>
-      <w:proofErr w:type="spellEnd"/>
-      <w:r>
-        <w:t xml:space="preserve">] (https://doi.org/10.1073/pnas.2503427122) </w:t>
+        <w:t xml:space="preserve">Yin, S., C. Zhang, C.S. Teitelbaum, **Y, Si**, G. Zhang, X. Wang, D. Mao, Z.Y.X. Huang, W. Frederik de Boer, J. Takekawa, D.J. Prosser, and X. Xiao, Landscape changes elevate the risk of avian influenza virus diversification and emergence in the East Asian–Australasian Flyway. Proceedings of the National Academy of Sciences, 2025. 122(34): p. e2503427122. </w:t>
+      </w:r>
+      <w:r>
+        <w:t>[</w:t>
+      </w:r>
+      <w:proofErr w:type="spellStart"/>
+      <w:r>
+        <w:t>doi</w:t>
+      </w:r>
+      <w:proofErr w:type="spellEnd"/>
+      <w:r>
+        <w:t>]</w:t>
+      </w:r>
+      <w:r>
+        <w:t xml:space="preserve">(https://doi.org/10.1073/pnas.2503427122) </w:t>
       </w:r>
     </w:p>
     <w:p/>
@@ -1392,15 +1416,21 @@
       </w:r>
       <w:proofErr w:type="spellEnd"/>
       <w:r>
-        <w:t xml:space="preserve"> Appl, 2024: p. e3010. [</w:t>
-      </w:r>
-      <w:proofErr w:type="spellStart"/>
-      <w:r>
-        <w:t>doi</w:t>
-      </w:r>
-      <w:proofErr w:type="spellEnd"/>
-      <w:r>
-        <w:t xml:space="preserve">] (https://doi.org/10.1002/eap.3010) </w:t>
+        <w:t xml:space="preserve"> Appl, 2024: p. e3010. </w:t>
+      </w:r>
+      <w:r>
+        <w:t>[</w:t>
+      </w:r>
+      <w:proofErr w:type="spellStart"/>
+      <w:r>
+        <w:t>doi</w:t>
+      </w:r>
+      <w:proofErr w:type="spellEnd"/>
+      <w:r>
+        <w:t>]</w:t>
+      </w:r>
+      <w:r>
+        <w:t xml:space="preserve">(https://doi.org/10.1002/eap.3010) </w:t>
       </w:r>
     </w:p>
     <w:p>
@@ -1413,15 +1443,21 @@
       </w:r>
       <w:r>
         <w:lastRenderedPageBreak/>
-        <w:t>resource waves during spring migration. Proceedings of the Royal Society B-Biological Sciences, 2024: p. 20241448. [</w:t>
-      </w:r>
-      <w:proofErr w:type="spellStart"/>
-      <w:r>
-        <w:t>doi</w:t>
-      </w:r>
-      <w:proofErr w:type="spellEnd"/>
-      <w:r>
-        <w:t xml:space="preserve">] (https://doi.org/10.1101/2023.04.14.536842) </w:t>
+        <w:t xml:space="preserve">resource waves during spring migration. Proceedings of the Royal Society B-Biological Sciences, 2024: p. 20241448. </w:t>
+      </w:r>
+      <w:r>
+        <w:t>[</w:t>
+      </w:r>
+      <w:proofErr w:type="spellStart"/>
+      <w:r>
+        <w:t>doi</w:t>
+      </w:r>
+      <w:proofErr w:type="spellEnd"/>
+      <w:r>
+        <w:t>]</w:t>
+      </w:r>
+      <w:r>
+        <w:t xml:space="preserve">(https://doi.org/10.1101/2023.04.14.536842) </w:t>
       </w:r>
     </w:p>
     <w:p>
@@ -1430,15 +1466,21 @@
       </w:r>
       <w:r>
         <w:tab/>
-        <w:t>Wei, J., F. Xu, E.F. Cole, B.C. Sheldon, W.F. de Boer, B. Wielstra, H. Fu, P. Gong, and **Y, Si**, Spatially heterogeneous shifts in vegetation phenology induced by climate change threaten the integrity of the avian migration network. Global Change Biology, 2024. 30(1): p. e17148. [</w:t>
-      </w:r>
-      <w:proofErr w:type="spellStart"/>
-      <w:r>
-        <w:t>doi</w:t>
-      </w:r>
-      <w:proofErr w:type="spellEnd"/>
-      <w:r>
-        <w:t xml:space="preserve">] (https://doi.org/10.1111/gcb.17148) </w:t>
+        <w:t xml:space="preserve">Wei, J., F. Xu, E.F. Cole, B.C. Sheldon, W.F. de Boer, B. Wielstra, H. Fu, P. Gong, and **Y, Si**, Spatially heterogeneous shifts in vegetation phenology induced by climate change threaten the integrity of the avian migration network. Global Change Biology, 2024. 30(1): p. e17148. </w:t>
+      </w:r>
+      <w:r>
+        <w:t>[</w:t>
+      </w:r>
+      <w:proofErr w:type="spellStart"/>
+      <w:r>
+        <w:t>doi</w:t>
+      </w:r>
+      <w:proofErr w:type="spellEnd"/>
+      <w:r>
+        <w:t>]</w:t>
+      </w:r>
+      <w:r>
+        <w:t xml:space="preserve">(https://doi.org/10.1111/gcb.17148) </w:t>
       </w:r>
     </w:p>
     <w:p>
@@ -1447,15 +1489,21 @@
       </w:r>
       <w:r>
         <w:tab/>
-        <w:t>Wang, Y., Z. Pan, **Y, Si**, L. Wen, and Y. Guo, Subadult movements contribute to population level migratory connectivity. Animal Behaviour, 2024. 215: p. 143-152. [</w:t>
-      </w:r>
-      <w:proofErr w:type="spellStart"/>
-      <w:r>
-        <w:t>doi</w:t>
-      </w:r>
-      <w:proofErr w:type="spellEnd"/>
-      <w:r>
-        <w:t xml:space="preserve">] (https://doi.org/10.1016/j.anbehav.2024.07.007) </w:t>
+        <w:t xml:space="preserve">Wang, Y., Z. Pan, **Y, Si**, L. Wen, and Y. Guo, Subadult movements contribute to population level migratory connectivity. Animal Behaviour, 2024. 215: p. 143-152. </w:t>
+      </w:r>
+      <w:r>
+        <w:t>[</w:t>
+      </w:r>
+      <w:proofErr w:type="spellStart"/>
+      <w:r>
+        <w:t>doi</w:t>
+      </w:r>
+      <w:proofErr w:type="spellEnd"/>
+      <w:r>
+        <w:t>]</w:t>
+      </w:r>
+      <w:r>
+        <w:t xml:space="preserve">(https://doi.org/10.1016/j.anbehav.2024.07.007) </w:t>
       </w:r>
     </w:p>
     <w:p/>
@@ -1471,15 +1519,21 @@
       </w:r>
       <w:r>
         <w:tab/>
-        <w:t>Zhang, L., X. Wan, R. Shi, P. Gong, and **Y, Si**, Comparing spatial patterns of 11 common cancers in Mainland China. BMC Public Health, 2022. 22(1): p. 1551. [</w:t>
-      </w:r>
-      <w:proofErr w:type="spellStart"/>
-      <w:r>
-        <w:t>doi</w:t>
-      </w:r>
-      <w:proofErr w:type="spellEnd"/>
-      <w:r>
-        <w:t xml:space="preserve">] (https://doi.org/10.1186/s12889-022-13926-y) </w:t>
+        <w:t xml:space="preserve">Zhang, L., X. Wan, R. Shi, P. Gong, and **Y, Si**, Comparing spatial patterns of 11 common cancers in Mainland China. BMC Public Health, 2022. 22(1): p. 1551. </w:t>
+      </w:r>
+      <w:r>
+        <w:t>[</w:t>
+      </w:r>
+      <w:proofErr w:type="spellStart"/>
+      <w:r>
+        <w:t>doi</w:t>
+      </w:r>
+      <w:proofErr w:type="spellEnd"/>
+      <w:r>
+        <w:t>]</w:t>
+      </w:r>
+      <w:r>
+        <w:t xml:space="preserve">(https://doi.org/10.1186/s12889-022-13926-y) </w:t>
       </w:r>
     </w:p>
     <w:p>
@@ -1488,15 +1542,21 @@
       </w:r>
       <w:r>
         <w:tab/>
-        <w:t>Hou, S., R. Yang, Y. Cao, Z. Zhao, Q. Peng, H. Wang, and **Y, Si**, A framework for identifying bird conservation priority areas in croplands at national level. Journal of Environmental Management, 2022. 324: p. 116330. [</w:t>
-      </w:r>
-      <w:proofErr w:type="spellStart"/>
-      <w:r>
-        <w:t>doi</w:t>
-      </w:r>
-      <w:proofErr w:type="spellEnd"/>
-      <w:r>
-        <w:t xml:space="preserve">] (https://doi.org/10.1016/j.jenvman.2022.116330) </w:t>
+        <w:t xml:space="preserve">Hou, S., R. Yang, Y. Cao, Z. Zhao, Q. Peng, H. Wang, and **Y, Si**, A framework for identifying bird conservation priority areas in croplands at national level. Journal of Environmental Management, 2022. 324: p. 116330. </w:t>
+      </w:r>
+      <w:r>
+        <w:t>[</w:t>
+      </w:r>
+      <w:proofErr w:type="spellStart"/>
+      <w:r>
+        <w:t>doi</w:t>
+      </w:r>
+      <w:proofErr w:type="spellEnd"/>
+      <w:r>
+        <w:t>]</w:t>
+      </w:r>
+      <w:r>
+        <w:t xml:space="preserve">(https://doi.org/10.1016/j.jenvman.2022.116330) </w:t>
       </w:r>
     </w:p>
     <w:p/>
@@ -1512,15 +1572,21 @@
       </w:r>
       <w:r>
         <w:tab/>
-        <w:t>Zhang, T., B. Tian, D. Sengupta, L. Zhang, and **Y, Si**, Global offshore wind turbine dataset. Scientific Data, 2021. 8(1): p. 191. [</w:t>
-      </w:r>
-      <w:proofErr w:type="spellStart"/>
-      <w:r>
-        <w:t>doi</w:t>
-      </w:r>
-      <w:proofErr w:type="spellEnd"/>
-      <w:r>
-        <w:t xml:space="preserve">] (https://doi.org/10.1038/s41597-021-00982-z) </w:t>
+        <w:t xml:space="preserve">Zhang, T., B. Tian, D. Sengupta, L. Zhang, and **Y, Si**, Global offshore wind turbine dataset. Scientific Data, 2021. 8(1): p. 191. </w:t>
+      </w:r>
+      <w:r>
+        <w:t>[</w:t>
+      </w:r>
+      <w:proofErr w:type="spellStart"/>
+      <w:r>
+        <w:t>doi</w:t>
+      </w:r>
+      <w:proofErr w:type="spellEnd"/>
+      <w:r>
+        <w:t>]</w:t>
+      </w:r>
+      <w:r>
+        <w:t xml:space="preserve">(https://doi.org/10.1038/s41597-021-00982-z) </w:t>
       </w:r>
     </w:p>
     <w:p>
@@ -1537,15 +1603,21 @@
       </w:r>
       <w:proofErr w:type="gramEnd"/>
       <w:r>
-        <w:t xml:space="preserve"> contrasting patterns of migration movements and disease outbreaks between congeneric waterfowl species reflect differing immunity? Geospatial Health, 2021. 16(1). [</w:t>
-      </w:r>
-      <w:proofErr w:type="spellStart"/>
-      <w:r>
-        <w:t>doi</w:t>
-      </w:r>
-      <w:proofErr w:type="spellEnd"/>
-      <w:r>
-        <w:t xml:space="preserve">] (https://doi.org/10.4081/gh.2021.909) </w:t>
+        <w:t xml:space="preserve"> contrasting patterns of migration movements and disease outbreaks between congeneric waterfowl species reflect differing immunity? Geospatial Health, 2021. 16(1). </w:t>
+      </w:r>
+      <w:r>
+        <w:t>[</w:t>
+      </w:r>
+      <w:proofErr w:type="spellStart"/>
+      <w:r>
+        <w:t>doi</w:t>
+      </w:r>
+      <w:proofErr w:type="spellEnd"/>
+      <w:r>
+        <w:t>]</w:t>
+      </w:r>
+      <w:r>
+        <w:t xml:space="preserve">(https://doi.org/10.4081/gh.2021.909) </w:t>
       </w:r>
     </w:p>
     <w:p>
@@ -1570,15 +1642,21 @@
       </w:r>
       <w:proofErr w:type="spellEnd"/>
       <w:r>
-        <w:t>, **Y, Si**, and W.F. de Boer, Indicators of site loss from a migration network: anthropogenic factors influence waterfowl movement patterns at stopover sites. Global Ecology and Conservation, 2021. 25: p. e01435. [</w:t>
-      </w:r>
-      <w:proofErr w:type="spellStart"/>
-      <w:r>
-        <w:t>doi</w:t>
-      </w:r>
-      <w:proofErr w:type="spellEnd"/>
-      <w:r>
-        <w:t xml:space="preserve">] (https://doi.org/10.1016/j.gecco.2020.e01435) </w:t>
+        <w:t xml:space="preserve">, **Y, Si**, and W.F. de Boer, Indicators of site loss from a migration network: anthropogenic factors influence waterfowl movement patterns at stopover sites. Global Ecology and Conservation, 2021. 25: p. e01435. </w:t>
+      </w:r>
+      <w:r>
+        <w:t>[</w:t>
+      </w:r>
+      <w:proofErr w:type="spellStart"/>
+      <w:r>
+        <w:t>doi</w:t>
+      </w:r>
+      <w:proofErr w:type="spellEnd"/>
+      <w:r>
+        <w:t>]</w:t>
+      </w:r>
+      <w:r>
+        <w:t xml:space="preserve">(https://doi.org/10.1016/j.gecco.2020.e01435) </w:t>
       </w:r>
     </w:p>
     <w:p>
@@ -1588,15 +1666,21 @@
       </w:r>
       <w:r>
         <w:tab/>
-        <w:t>**Si, Y.**, F. Xu, J. Wei, L. Zhang, N. Murray, R. Yang, K. Ma, and P. Gong, A systematic network-based migratory bird monitoring and protection system is needed in China. Science Bulletin, 2021. 66(10): p. 955-957. [</w:t>
-      </w:r>
-      <w:proofErr w:type="spellStart"/>
-      <w:r>
-        <w:t>doi</w:t>
-      </w:r>
-      <w:proofErr w:type="spellEnd"/>
-      <w:r>
-        <w:t xml:space="preserve">] (https://doi.org/10.1016/j.scib.2021.01.033) </w:t>
+        <w:t xml:space="preserve">**Si, Y.**, F. Xu, J. Wei, L. Zhang, N. Murray, R. Yang, K. Ma, and P. Gong, A systematic network-based migratory bird monitoring and protection system is needed in China. Science Bulletin, 2021. 66(10): p. 955-957. </w:t>
+      </w:r>
+      <w:r>
+        <w:t>[</w:t>
+      </w:r>
+      <w:proofErr w:type="spellStart"/>
+      <w:r>
+        <w:t>doi</w:t>
+      </w:r>
+      <w:proofErr w:type="spellEnd"/>
+      <w:r>
+        <w:t>]</w:t>
+      </w:r>
+      <w:r>
+        <w:t xml:space="preserve">(https://doi.org/10.1016/j.scib.2021.01.033) </w:t>
       </w:r>
     </w:p>
     <w:p>
@@ -1605,15 +1689,21 @@
       </w:r>
       <w:r>
         <w:tab/>
-        <w:t>Gao, B., P. Gong, W. Zhang, J. Yang, and **Y, Si**, Multiscale effects of habitat and surrounding matrices on waterbird diversity in the Yangtze River Floodplain. Landscape Ecology, 2021. 36: p. 179–190. [</w:t>
-      </w:r>
-      <w:proofErr w:type="spellStart"/>
-      <w:r>
-        <w:t>doi</w:t>
-      </w:r>
-      <w:proofErr w:type="spellEnd"/>
-      <w:r>
-        <w:t xml:space="preserve">] (https://doi.org/10.1007/s10980-020-01131-4) </w:t>
+        <w:t xml:space="preserve">Gao, B., P. Gong, W. Zhang, J. Yang, and **Y, Si**, Multiscale effects of habitat and surrounding matrices on waterbird diversity in the Yangtze River Floodplain. Landscape Ecology, 2021. 36: p. 179–190. </w:t>
+      </w:r>
+      <w:r>
+        <w:t>[</w:t>
+      </w:r>
+      <w:proofErr w:type="spellStart"/>
+      <w:r>
+        <w:t>doi</w:t>
+      </w:r>
+      <w:proofErr w:type="spellEnd"/>
+      <w:r>
+        <w:t>]</w:t>
+      </w:r>
+      <w:r>
+        <w:t xml:space="preserve">(https://doi.org/10.1007/s10980-020-01131-4) </w:t>
       </w:r>
     </w:p>
     <w:p/>
@@ -1629,15 +1719,21 @@
       </w:r>
       <w:r>
         <w:tab/>
-        <w:t>Yin, S., H.J. de Knegt, M.C.M. de Jong, **Y, Si**, H.H.T. Prins, Z.Y.X. Huang, and W.F. de Boer, Effects of migration network configuration and migration synchrony on infection prevalence in geese. Journal of Theoretical Biology, 2020. 502: p. 110315. [</w:t>
-      </w:r>
-      <w:proofErr w:type="spellStart"/>
-      <w:r>
-        <w:t>doi</w:t>
-      </w:r>
-      <w:proofErr w:type="spellEnd"/>
-      <w:r>
-        <w:t xml:space="preserve">] (https://doi.org/10.1016/j.jtbi.2020.110315) </w:t>
+        <w:t xml:space="preserve">Yin, S., H.J. de Knegt, M.C.M. de Jong, **Y, Si**, H.H.T. Prins, Z.Y.X. Huang, and W.F. de Boer, Effects of migration network configuration and migration synchrony on infection prevalence in geese. Journal of Theoretical Biology, 2020. 502: p. 110315. </w:t>
+      </w:r>
+      <w:r>
+        <w:t>[</w:t>
+      </w:r>
+      <w:proofErr w:type="spellStart"/>
+      <w:r>
+        <w:t>doi</w:t>
+      </w:r>
+      <w:proofErr w:type="spellEnd"/>
+      <w:r>
+        <w:t>]</w:t>
+      </w:r>
+      <w:r>
+        <w:t xml:space="preserve">(https://doi.org/10.1016/j.jtbi.2020.110315) </w:t>
       </w:r>
     </w:p>
     <w:p>
@@ -1646,15 +1742,21 @@
       </w:r>
       <w:r>
         <w:tab/>
-        <w:t>Xu, Y., **Y, Si**, J. Takekawa, Q. Liu, H.H.T. Prins, S. Yin, D.J. Prosser, P. Gong, and W.F. de Boer, A network approach to prioritize conservation efforts for migratory birds. Conservation Biology, 2020. 34(2): p. 416-426. [</w:t>
-      </w:r>
-      <w:proofErr w:type="spellStart"/>
-      <w:r>
-        <w:t>doi</w:t>
-      </w:r>
-      <w:proofErr w:type="spellEnd"/>
-      <w:r>
-        <w:t xml:space="preserve">] (https://doi.org/10.1111/cobi.13383) </w:t>
+        <w:t xml:space="preserve">Xu, Y., **Y, Si**, J. Takekawa, Q. Liu, H.H.T. Prins, S. Yin, D.J. Prosser, P. Gong, and W.F. de Boer, A network approach to prioritize conservation efforts for migratory birds. Conservation Biology, 2020. 34(2): p. 416-426. </w:t>
+      </w:r>
+      <w:r>
+        <w:t>[</w:t>
+      </w:r>
+      <w:proofErr w:type="spellStart"/>
+      <w:r>
+        <w:t>doi</w:t>
+      </w:r>
+      <w:proofErr w:type="spellEnd"/>
+      <w:r>
+        <w:t>]</w:t>
+      </w:r>
+      <w:r>
+        <w:t xml:space="preserve">(https://doi.org/10.1111/cobi.13383) </w:t>
       </w:r>
     </w:p>
     <w:p>
@@ -1671,15 +1773,21 @@
       </w:r>
       <w:proofErr w:type="gramEnd"/>
       <w:r>
-        <w:t xml:space="preserve"> human pressure on farmland could rescue China’s declining wintering geese. Movement Ecology, 2020. 8(1): p. 35. [</w:t>
-      </w:r>
-      <w:proofErr w:type="spellStart"/>
-      <w:r>
-        <w:t>doi</w:t>
-      </w:r>
-      <w:proofErr w:type="spellEnd"/>
-      <w:r>
-        <w:t xml:space="preserve">] (https://doi.org/10.1186/s40462-020-00220-y) </w:t>
+        <w:t xml:space="preserve"> human pressure on farmland could rescue China’s declining wintering geese. Movement Ecology, 2020. 8(1): p. 35. </w:t>
+      </w:r>
+      <w:r>
+        <w:t>[</w:t>
+      </w:r>
+      <w:proofErr w:type="spellStart"/>
+      <w:r>
+        <w:t>doi</w:t>
+      </w:r>
+      <w:proofErr w:type="spellEnd"/>
+      <w:r>
+        <w:t>]</w:t>
+      </w:r>
+      <w:r>
+        <w:t xml:space="preserve">(https://doi.org/10.1186/s40462-020-00220-y) </w:t>
       </w:r>
     </w:p>
     <w:p/>
@@ -1695,15 +1803,21 @@
       </w:r>
       <w:r>
         <w:tab/>
-        <w:t>Xu, Y., **Y, Si**, S. Yin, W. Zhang, M. Grishchenko, H.H.T. Prins, P. Gong, and W.F. de Boer, Species-dependent effects of habitat degradation in relation to seasonal distribution of migratory waterfowl in the East Asian–Australasian Flyway. Landscape Ecology, 2019. 34(2): p. 243-257. [</w:t>
-      </w:r>
-      <w:proofErr w:type="spellStart"/>
-      <w:r>
-        <w:t>doi</w:t>
-      </w:r>
-      <w:proofErr w:type="spellEnd"/>
-      <w:r>
-        <w:t xml:space="preserve">] (https://doi.org/10.1007/s10980-018-00767-7) </w:t>
+        <w:t xml:space="preserve">Xu, Y., **Y, Si**, S. Yin, W. Zhang, M. Grishchenko, H.H.T. Prins, P. Gong, and W.F. de Boer, Species-dependent effects of habitat degradation in relation to seasonal distribution of migratory waterfowl in the East Asian–Australasian Flyway. Landscape Ecology, 2019. 34(2): p. 243-257. </w:t>
+      </w:r>
+      <w:r>
+        <w:t>[</w:t>
+      </w:r>
+      <w:proofErr w:type="spellStart"/>
+      <w:r>
+        <w:t>doi</w:t>
+      </w:r>
+      <w:proofErr w:type="spellEnd"/>
+      <w:r>
+        <w:t>]</w:t>
+      </w:r>
+      <w:r>
+        <w:t xml:space="preserve">(https://doi.org/10.1007/s10980-018-00767-7) </w:t>
       </w:r>
     </w:p>
     <w:p>
@@ -1712,15 +1826,21 @@
       </w:r>
       <w:r>
         <w:tab/>
-        <w:t>Xu, Y., Y. **Si, Y.** Wang, Y. Zhang, H.H.T. Prins, L. Cao, and W.F. de Boer, Loss of functional connectivity in migration networks induces population decline in migratory birds. Ecological Applications, 2019. 29(7): p. e01960. [</w:t>
-      </w:r>
-      <w:proofErr w:type="spellStart"/>
-      <w:r>
-        <w:t>doi</w:t>
-      </w:r>
-      <w:proofErr w:type="spellEnd"/>
-      <w:r>
-        <w:t xml:space="preserve">] (https://doi.org/10.1002/eap.1960) </w:t>
+        <w:t xml:space="preserve">Xu, Y., Y. **Si, Y.** Wang, Y. Zhang, H.H.T. Prins, L. Cao, and W.F. de Boer, Loss of functional connectivity in migration networks induces population decline in migratory birds. Ecological Applications, 2019. 29(7): p. e01960. </w:t>
+      </w:r>
+      <w:r>
+        <w:t>[</w:t>
+      </w:r>
+      <w:proofErr w:type="spellStart"/>
+      <w:r>
+        <w:t>doi</w:t>
+      </w:r>
+      <w:proofErr w:type="spellEnd"/>
+      <w:r>
+        <w:t>]</w:t>
+      </w:r>
+      <w:r>
+        <w:t xml:space="preserve">(https://doi.org/10.1002/eap.1960) </w:t>
       </w:r>
     </w:p>
     <w:p>
@@ -1729,15 +1849,21 @@
       </w:r>
       <w:r>
         <w:tab/>
-        <w:t>Xu, F. and **Y, Si**, The frost wave hypothesis: How the environment drives autumn departure of migratory waterfowl. Ecological Indicators, 2019. 101: p. 1018-1025. [</w:t>
-      </w:r>
-      <w:proofErr w:type="spellStart"/>
-      <w:r>
-        <w:t>doi</w:t>
-      </w:r>
-      <w:proofErr w:type="spellEnd"/>
-      <w:r>
-        <w:t xml:space="preserve">] (https://doi.org/10.1016/j.ecolind.2019.02.024) </w:t>
+        <w:t xml:space="preserve">Xu, F. and **Y, Si**, The frost wave hypothesis: How the environment drives autumn departure of migratory waterfowl. Ecological Indicators, 2019. 101: p. 1018-1025. </w:t>
+      </w:r>
+      <w:r>
+        <w:t>[</w:t>
+      </w:r>
+      <w:proofErr w:type="spellStart"/>
+      <w:r>
+        <w:t>doi</w:t>
+      </w:r>
+      <w:proofErr w:type="spellEnd"/>
+      <w:r>
+        <w:t>]</w:t>
+      </w:r>
+      <w:r>
+        <w:t xml:space="preserve">(https://doi.org/10.1016/j.ecolind.2019.02.024) </w:t>
       </w:r>
     </w:p>
     <w:p>
@@ -1747,15 +1873,21 @@
       </w:r>
       <w:r>
         <w:tab/>
-        <w:t>Wei, J., Q. Xin, L. Ji, P. Gong, and **Y, Si**, Improved satellite-derived identification of spatiotemporal foraging area for herbivorous waterfowl. Ecological Indicators, 2019. 99: p. 83-90. [</w:t>
-      </w:r>
-      <w:proofErr w:type="spellStart"/>
-      <w:r>
-        <w:t>doi</w:t>
-      </w:r>
-      <w:proofErr w:type="spellEnd"/>
-      <w:r>
-        <w:t xml:space="preserve">] (https://doi.org/10.1016/j.ecolind.2018.12.016) </w:t>
+        <w:t xml:space="preserve">Wei, J., Q. Xin, L. Ji, P. Gong, and **Y, Si**, Improved satellite-derived identification of spatiotemporal foraging area for herbivorous waterfowl. Ecological Indicators, 2019. 99: p. 83-90. </w:t>
+      </w:r>
+      <w:r>
+        <w:t>[</w:t>
+      </w:r>
+      <w:proofErr w:type="spellStart"/>
+      <w:r>
+        <w:t>doi</w:t>
+      </w:r>
+      <w:proofErr w:type="spellEnd"/>
+      <w:r>
+        <w:t>]</w:t>
+      </w:r>
+      <w:r>
+        <w:t xml:space="preserve">(https://doi.org/10.1016/j.ecolind.2018.12.016) </w:t>
       </w:r>
     </w:p>
     <w:p>
@@ -1771,15 +1903,21 @@
       </w:r>
       <w:proofErr w:type="spellEnd"/>
       <w:r>
-        <w:t>, Z., J. Yang, B. Wielstra, J. Wei, F. Xu, and **Y, Si**, Prioritizing Green Spaces for Biodiversity Conservation in Beijing Based on Habitat Network Connectivity. Sustainability, 2019. 11(7). [</w:t>
-      </w:r>
-      <w:proofErr w:type="spellStart"/>
-      <w:r>
-        <w:t>doi</w:t>
-      </w:r>
-      <w:proofErr w:type="spellEnd"/>
-      <w:r>
-        <w:t xml:space="preserve">] (https://doi.org/10.3390/su11072042) </w:t>
+        <w:t xml:space="preserve">, Z., J. Yang, B. Wielstra, J. Wei, F. Xu, and **Y, Si**, Prioritizing Green Spaces for Biodiversity Conservation in Beijing Based on Habitat Network Connectivity. Sustainability, 2019. 11(7). </w:t>
+      </w:r>
+      <w:r>
+        <w:t>[</w:t>
+      </w:r>
+      <w:proofErr w:type="spellStart"/>
+      <w:r>
+        <w:t>doi</w:t>
+      </w:r>
+      <w:proofErr w:type="spellEnd"/>
+      <w:r>
+        <w:t>]</w:t>
+      </w:r>
+      <w:r>
+        <w:t xml:space="preserve">(https://doi.org/10.3390/su11072042) </w:t>
       </w:r>
     </w:p>
     <w:p>
@@ -1812,15 +1950,21 @@
       </w:r>
       <w:proofErr w:type="spellEnd"/>
       <w:r>
-        <w:t>, **Y, Si**, H. Tian, R.H.S. Kraus, M. Gilbert, G.-Z. Han, X. Ji, H.H.T. Prins, and W.F. de Boer, Contrasting effects of host species and phylogenetic diversity on the occurrence of HPAI H5N1 in European wild birds. Journal of Animal Ecology, 2019. 88: p. 1044-1053. [</w:t>
-      </w:r>
-      <w:proofErr w:type="spellStart"/>
-      <w:r>
-        <w:t>doi</w:t>
-      </w:r>
-      <w:proofErr w:type="spellEnd"/>
-      <w:r>
-        <w:t xml:space="preserve">] (https://doi.org/10.1111/1365-2656.12997) </w:t>
+        <w:t xml:space="preserve">, **Y, Si**, H. Tian, R.H.S. Kraus, M. Gilbert, G.-Z. Han, X. Ji, H.H.T. Prins, and W.F. de Boer, Contrasting effects of host species and phylogenetic diversity on the occurrence of HPAI H5N1 in European wild birds. Journal of Animal Ecology, 2019. 88: p. 1044-1053. </w:t>
+      </w:r>
+      <w:r>
+        <w:t>[</w:t>
+      </w:r>
+      <w:proofErr w:type="spellStart"/>
+      <w:r>
+        <w:t>doi</w:t>
+      </w:r>
+      <w:proofErr w:type="spellEnd"/>
+      <w:r>
+        <w:t>]</w:t>
+      </w:r>
+      <w:r>
+        <w:t xml:space="preserve">(https://doi.org/10.1111/1365-2656.12997) </w:t>
       </w:r>
     </w:p>
     <w:p/>
@@ -1836,15 +1980,21 @@
       </w:r>
       <w:r>
         <w:tab/>
-        <w:t>Zhang, W., X. Li, L. Yu, and **Y, Si**, Multi-scale habitat selection by two declining East Asian waterfowl species at their core spring stopover area. Ecological Indicators, 2018. 87: p. 127-135. [</w:t>
-      </w:r>
-      <w:proofErr w:type="spellStart"/>
-      <w:r>
-        <w:t>doi</w:t>
-      </w:r>
-      <w:proofErr w:type="spellEnd"/>
-      <w:r>
-        <w:t xml:space="preserve">] (https://doi.org/10.1016/j.ecolind.2017.12.035) </w:t>
+        <w:t xml:space="preserve">Zhang, W., X. Li, L. Yu, and **Y, Si**, Multi-scale habitat selection by two declining East Asian waterfowl species at their core spring stopover area. Ecological Indicators, 2018. 87: p. 127-135. </w:t>
+      </w:r>
+      <w:r>
+        <w:t>[</w:t>
+      </w:r>
+      <w:proofErr w:type="spellStart"/>
+      <w:r>
+        <w:t>doi</w:t>
+      </w:r>
+      <w:proofErr w:type="spellEnd"/>
+      <w:r>
+        <w:t>]</w:t>
+      </w:r>
+      <w:r>
+        <w:t xml:space="preserve">(https://doi.org/10.1016/j.ecolind.2017.12.035) </w:t>
       </w:r>
     </w:p>
     <w:p>
@@ -1909,15 +2059,21 @@
       </w:r>
       <w:proofErr w:type="spellEnd"/>
       <w:r>
-        <w:t>) – an addition to the New Atlas of Amphibians and Reptiles of Europe. Amphibia-Reptilia, 2018. 39(2): p. 252-259. [</w:t>
-      </w:r>
-      <w:proofErr w:type="spellStart"/>
-      <w:r>
-        <w:t>doi</w:t>
-      </w:r>
-      <w:proofErr w:type="spellEnd"/>
-      <w:r>
-        <w:t xml:space="preserve">] (https://doi.org/10.1163/15685381-17000128) </w:t>
+        <w:t xml:space="preserve">) – an addition to the New Atlas of Amphibians and Reptiles of Europe. Amphibia-Reptilia, 2018. 39(2): p. 252-259. </w:t>
+      </w:r>
+      <w:r>
+        <w:t>[</w:t>
+      </w:r>
+      <w:proofErr w:type="spellStart"/>
+      <w:r>
+        <w:t>doi</w:t>
+      </w:r>
+      <w:proofErr w:type="spellEnd"/>
+      <w:r>
+        <w:t>]</w:t>
+      </w:r>
+      <w:r>
+        <w:t xml:space="preserve">(https://doi.org/10.1163/15685381-17000128) </w:t>
       </w:r>
     </w:p>
     <w:p>
@@ -1934,15 +2090,21 @@
       </w:r>
       <w:proofErr w:type="spellEnd"/>
       <w:r>
-        <w:t>. Boer, H.H.T. Prins, and P. Gong, Spring migration patterns, habitat use and stopover site protection status for two declining waterfowl species wintering in China as revealed by satellite tracking. Ecology and Evolution, 2018. 8: p. 6280-6289. [</w:t>
-      </w:r>
-      <w:proofErr w:type="spellStart"/>
-      <w:r>
-        <w:t>doi</w:t>
-      </w:r>
-      <w:proofErr w:type="spellEnd"/>
-      <w:r>
-        <w:t xml:space="preserve">] (https://doi.org/10.1002/ece3.4174) </w:t>
+        <w:t xml:space="preserve">. Boer, H.H.T. Prins, and P. Gong, Spring migration patterns, habitat use and stopover site protection status for two declining waterfowl species wintering in China as revealed by satellite tracking. Ecology and Evolution, 2018. 8: p. 6280-6289. </w:t>
+      </w:r>
+      <w:r>
+        <w:t>[</w:t>
+      </w:r>
+      <w:proofErr w:type="spellStart"/>
+      <w:r>
+        <w:t>doi</w:t>
+      </w:r>
+      <w:proofErr w:type="spellEnd"/>
+      <w:r>
+        <w:t>]</w:t>
+      </w:r>
+      <w:r>
+        <w:t xml:space="preserve">(https://doi.org/10.1002/ece3.4174) </w:t>
       </w:r>
     </w:p>
     <w:p>
@@ -1959,15 +2121,21 @@
       </w:r>
       <w:proofErr w:type="gramEnd"/>
       <w:r>
-        <w:t xml:space="preserve"> patterns and hotspots of global land cover transitions using the ESA CCI Land Cover dataset. Remote Sensing Letters, 2018. 9(10): p. 972-981. [</w:t>
-      </w:r>
-      <w:proofErr w:type="spellStart"/>
-      <w:r>
-        <w:t>doi</w:t>
-      </w:r>
-      <w:proofErr w:type="spellEnd"/>
-      <w:r>
-        <w:t xml:space="preserve">] (https://doi.org/10.1080/2150704X.2018.1500070) </w:t>
+        <w:t xml:space="preserve"> patterns and hotspots of global land cover transitions using the ESA CCI Land Cover dataset. Remote Sensing Letters, 2018. 9(10): p. 972-981. </w:t>
+      </w:r>
+      <w:r>
+        <w:t>[</w:t>
+      </w:r>
+      <w:proofErr w:type="spellStart"/>
+      <w:r>
+        <w:t>doi</w:t>
+      </w:r>
+      <w:proofErr w:type="spellEnd"/>
+      <w:r>
+        <w:t>]</w:t>
+      </w:r>
+      <w:r>
+        <w:t xml:space="preserve">(https://doi.org/10.1080/2150704X.2018.1500070) </w:t>
       </w:r>
     </w:p>
     <w:p/>
@@ -1983,15 +2151,21 @@
       </w:r>
       <w:r>
         <w:tab/>
-        <w:t>Zhang, H., **Y, Si**, X. Wang, and P. Gong, Environmental Drivers and Predicted Risk of Bacillary Dysentery in Southwest China. International Journal of Environmental Research and Public Health, 2017. 14(7): p. 782. [</w:t>
-      </w:r>
-      <w:proofErr w:type="spellStart"/>
-      <w:r>
-        <w:t>doi</w:t>
-      </w:r>
-      <w:proofErr w:type="spellEnd"/>
-      <w:r>
-        <w:t>] (https://doi.org/10.3390/ijerph14070782)</w:t>
+        <w:t xml:space="preserve">Zhang, H., **Y, Si**, X. Wang, and P. Gong, Environmental Drivers and Predicted Risk of Bacillary Dysentery in Southwest China. International Journal of Environmental Research and Public Health, 2017. 14(7): p. 782. </w:t>
+      </w:r>
+      <w:r>
+        <w:t>[</w:t>
+      </w:r>
+      <w:proofErr w:type="spellStart"/>
+      <w:r>
+        <w:t>doi</w:t>
+      </w:r>
+      <w:proofErr w:type="spellEnd"/>
+      <w:r>
+        <w:t>]</w:t>
+      </w:r>
+      <w:r>
+        <w:t>(https://doi.org/10.3390/ijerph14070782)</w:t>
       </w:r>
     </w:p>
     <w:p>
@@ -2000,15 +2174,21 @@
       </w:r>
       <w:r>
         <w:tab/>
-        <w:t>Yu, L., X. Li, C. Li, Y. Zhao, Z. Niu, H. Huang, J. Wang, Y. Cheng, H. Lu, **Y, Si**, C. Yu, H. Fu, and P. Gong, Using a global reference sample set and a cropland map for area estimation in China. Science China Earth Sciences, 2017. 60(2): p. 277-285. [</w:t>
-      </w:r>
-      <w:proofErr w:type="spellStart"/>
-      <w:r>
-        <w:t>doi</w:t>
-      </w:r>
-      <w:proofErr w:type="spellEnd"/>
-      <w:r>
-        <w:t xml:space="preserve">] (https://doi.org/10.1007/s11430-016-0064-5) </w:t>
+        <w:t xml:space="preserve">Yu, L., X. Li, C. Li, Y. Zhao, Z. Niu, H. Huang, J. Wang, Y. Cheng, H. Lu, **Y, Si**, C. Yu, H. Fu, and P. Gong, Using a global reference sample set and a cropland map for area estimation in China. Science China Earth Sciences, 2017. 60(2): p. 277-285. </w:t>
+      </w:r>
+      <w:r>
+        <w:t>[</w:t>
+      </w:r>
+      <w:proofErr w:type="spellStart"/>
+      <w:r>
+        <w:t>doi</w:t>
+      </w:r>
+      <w:proofErr w:type="spellEnd"/>
+      <w:r>
+        <w:t>]</w:t>
+      </w:r>
+      <w:r>
+        <w:t xml:space="preserve">(https://doi.org/10.1007/s11430-016-0064-5) </w:t>
       </w:r>
     </w:p>
     <w:p>
@@ -2052,7 +2232,19 @@
         <w:rPr>
           <w:lang w:val="pt-BR"/>
         </w:rPr>
-        <w:t xml:space="preserve">PLOS ONE, 2017. 12(5): p. e0177790. [doi] (https://doi.org/10.1371/journal.pone.0177790) </w:t>
+        <w:t xml:space="preserve">PLOS ONE, 2017. 12(5): p. e0177790. </w:t>
+      </w:r>
+      <w:r>
+        <w:rPr>
+          <w:lang w:val="pt-BR"/>
+        </w:rPr>
+        <w:t>[doi]</w:t>
+      </w:r>
+      <w:r>
+        <w:rPr>
+          <w:lang w:val="pt-BR"/>
+        </w:rPr>
+        <w:t xml:space="preserve">(https://doi.org/10.1371/journal.pone.0177790) </w:t>
       </w:r>
     </w:p>
     <w:p>
@@ -2061,15 +2253,21 @@
       </w:r>
       <w:r>
         <w:tab/>
-        <w:t>Xu, F., G. Liu, and **Y, Si**, Local temperature and El Niño Southern Oscillation influence migration phenology of East Asian migratory waterbirds wintering in Poyang, China. Integrative Zoology, 2017: p. 303-317. [</w:t>
-      </w:r>
-      <w:proofErr w:type="spellStart"/>
-      <w:r>
-        <w:t>doi</w:t>
-      </w:r>
-      <w:proofErr w:type="spellEnd"/>
-      <w:r>
-        <w:t xml:space="preserve">] (https://doi.org/10.1111/1749-4877.12248) </w:t>
+        <w:t xml:space="preserve">Xu, F., G. Liu, and **Y, Si**, Local temperature and El Niño Southern Oscillation influence migration phenology of East Asian migratory waterbirds wintering in Poyang, China. Integrative Zoology, 2017: p. 303-317. </w:t>
+      </w:r>
+      <w:r>
+        <w:t>[</w:t>
+      </w:r>
+      <w:proofErr w:type="spellStart"/>
+      <w:r>
+        <w:t>doi</w:t>
+      </w:r>
+      <w:proofErr w:type="spellEnd"/>
+      <w:r>
+        <w:t>]</w:t>
+      </w:r>
+      <w:r>
+        <w:t xml:space="preserve">(https://doi.org/10.1111/1749-4877.12248) </w:t>
       </w:r>
     </w:p>
     <w:p>
@@ -2078,15 +2276,21 @@
       </w:r>
       <w:r>
         <w:tab/>
-        <w:t>Li, X., **Y, Si**, L. Ji, and P. Gong, Dynamic response of East Asian Greater White-fronted Geese to changes of environment during migration: Use of multi-temporal species distribution model. Ecological Modelling, 2017. 360: p. 70-79. [</w:t>
-      </w:r>
-      <w:proofErr w:type="spellStart"/>
-      <w:r>
-        <w:t>doi</w:t>
-      </w:r>
-      <w:proofErr w:type="spellEnd"/>
-      <w:r>
-        <w:t xml:space="preserve">] (https://doi.org/10.1016/j.ecolmodel.2017.06.004) </w:t>
+        <w:t xml:space="preserve">Li, X., **Y, Si**, L. Ji, and P. Gong, Dynamic response of East Asian Greater White-fronted Geese to changes of environment during migration: Use of multi-temporal species distribution model. Ecological Modelling, 2017. 360: p. 70-79. </w:t>
+      </w:r>
+      <w:r>
+        <w:t>[</w:t>
+      </w:r>
+      <w:proofErr w:type="spellStart"/>
+      <w:r>
+        <w:t>doi</w:t>
+      </w:r>
+      <w:proofErr w:type="spellEnd"/>
+      <w:r>
+        <w:t>]</w:t>
+      </w:r>
+      <w:r>
+        <w:t xml:space="preserve">(https://doi.org/10.1016/j.ecolmodel.2017.06.004) </w:t>
       </w:r>
     </w:p>
     <w:p>
@@ -2103,15 +2307,21 @@
       </w:r>
       <w:proofErr w:type="spellEnd"/>
       <w:r>
-        <w:t>, H. Yu, X. Wang, **Y, Si**, Z. Xu, Z. Yuan, W. Jeong, L. Cao, and A.D. Fox, Water level affects availability of optimal feeding habitats for threatened migratory waterbirds. Ecology and Evolution, 2017. 7(23): p. 10440-10450. [</w:t>
-      </w:r>
-      <w:proofErr w:type="spellStart"/>
-      <w:r>
-        <w:t>doi</w:t>
-      </w:r>
-      <w:proofErr w:type="spellEnd"/>
-      <w:r>
-        <w:t xml:space="preserve">] (https://doi.org/10.1002/ece3.3566) </w:t>
+        <w:t xml:space="preserve">, H. Yu, X. Wang, **Y, Si**, Z. Xu, Z. Yuan, W. Jeong, L. Cao, and A.D. Fox, Water level affects availability of optimal feeding habitats for threatened migratory waterbirds. Ecology and Evolution, 2017. 7(23): p. 10440-10450. </w:t>
+      </w:r>
+      <w:r>
+        <w:t>[</w:t>
+      </w:r>
+      <w:proofErr w:type="spellStart"/>
+      <w:r>
+        <w:t>doi</w:t>
+      </w:r>
+      <w:proofErr w:type="spellEnd"/>
+      <w:r>
+        <w:t>]</w:t>
+      </w:r>
+      <w:r>
+        <w:t xml:space="preserve">(https://doi.org/10.1002/ece3.3566) </w:t>
       </w:r>
     </w:p>
     <w:p/>
@@ -2136,15 +2346,21 @@
       </w:r>
       <w:r>
         <w:tab/>
-        <w:t>Xu, Y., P. Gong, B. Wielstra, and **Y, Si**, Southward autumn migration of waterfowl facilitates cross-continental transmission of the highly pathogenic avian influenza H5N1 virus. Scientific Reports, 2016. 6: p. 30262. [</w:t>
-      </w:r>
-      <w:proofErr w:type="spellStart"/>
-      <w:r>
-        <w:t>doi</w:t>
-      </w:r>
-      <w:proofErr w:type="spellEnd"/>
-      <w:r>
-        <w:t xml:space="preserve">] (https://doi.org/10.1038/srep30262) </w:t>
+        <w:t xml:space="preserve">Xu, Y., P. Gong, B. Wielstra, and **Y, Si**, Southward autumn migration of waterfowl facilitates cross-continental transmission of the highly pathogenic avian influenza H5N1 virus. Scientific Reports, 2016. 6: p. 30262. </w:t>
+      </w:r>
+      <w:r>
+        <w:t>[</w:t>
+      </w:r>
+      <w:proofErr w:type="spellStart"/>
+      <w:r>
+        <w:t>doi</w:t>
+      </w:r>
+      <w:proofErr w:type="spellEnd"/>
+      <w:r>
+        <w:t>]</w:t>
+      </w:r>
+      <w:r>
+        <w:t xml:space="preserve">(https://doi.org/10.1038/srep30262) </w:t>
       </w:r>
     </w:p>
     <w:p>
@@ -2170,15 +2386,21 @@
       </w:r>
       <w:proofErr w:type="spellEnd"/>
       <w:r>
-        <w:t xml:space="preserve"> of crop gross primary production. International Journal of Applied Earth Observation and Geoinformation, 2016. 50: p. 51-63. [</w:t>
-      </w:r>
-      <w:proofErr w:type="spellStart"/>
-      <w:r>
-        <w:t>doi</w:t>
-      </w:r>
-      <w:proofErr w:type="spellEnd"/>
-      <w:r>
-        <w:t xml:space="preserve">] (https://doi.org/10.1016/j.jag.2016.03.002) </w:t>
+        <w:t xml:space="preserve"> of crop gross primary production. International Journal of Applied Earth Observation and Geoinformation, 2016. 50: p. 51-63. </w:t>
+      </w:r>
+      <w:r>
+        <w:t>[</w:t>
+      </w:r>
+      <w:proofErr w:type="spellStart"/>
+      <w:r>
+        <w:t>doi</w:t>
+      </w:r>
+      <w:proofErr w:type="spellEnd"/>
+      <w:r>
+        <w:t>]</w:t>
+      </w:r>
+      <w:r>
+        <w:t xml:space="preserve">(https://doi.org/10.1016/j.jag.2016.03.002) </w:t>
       </w:r>
     </w:p>
     <w:p/>
@@ -2194,23 +2416,35 @@
       </w:r>
       <w:r>
         <w:tab/>
-        <w:t>**Si, Y.**, Q. Xin, H.T. Prins, W. de Boer, and P. Gong, Improving the quantification of waterfowl migration with remote sensing and bird tracking. Science Bulletin, 2015. 60(23): p. 1984-1993. [</w:t>
-      </w:r>
-      <w:proofErr w:type="spellStart"/>
-      <w:r>
-        <w:t>doi</w:t>
-      </w:r>
-      <w:proofErr w:type="spellEnd"/>
-      <w:r>
-        <w:t>] ([</w:t>
-      </w:r>
-      <w:proofErr w:type="spellStart"/>
-      <w:r>
-        <w:t>doi</w:t>
-      </w:r>
-      <w:proofErr w:type="spellEnd"/>
-      <w:r>
-        <w:t xml:space="preserve">] (https://doi.org/10.1007/s11434-015-0930-9) </w:t>
+        <w:t xml:space="preserve">**Si, Y.**, Q. Xin, H.T. Prins, W. de Boer, and P. Gong, Improving the quantification of waterfowl migration with remote sensing and bird tracking. Science Bulletin, 2015. 60(23): p. 1984-1993. </w:t>
+      </w:r>
+      <w:r>
+        <w:t>[</w:t>
+      </w:r>
+      <w:proofErr w:type="spellStart"/>
+      <w:r>
+        <w:t>doi</w:t>
+      </w:r>
+      <w:proofErr w:type="spellEnd"/>
+      <w:r>
+        <w:t>]</w:t>
+      </w:r>
+      <w:r>
+        <w:t>(</w:t>
+      </w:r>
+      <w:r>
+        <w:t>[</w:t>
+      </w:r>
+      <w:proofErr w:type="spellStart"/>
+      <w:r>
+        <w:t>doi</w:t>
+      </w:r>
+      <w:proofErr w:type="spellEnd"/>
+      <w:r>
+        <w:t>]</w:t>
+      </w:r>
+      <w:r>
+        <w:t xml:space="preserve">(https://doi.org/10.1007/s11434-015-0930-9) </w:t>
       </w:r>
     </w:p>
     <w:p>
@@ -2219,15 +2453,21 @@
       </w:r>
       <w:r>
         <w:tab/>
-        <w:t>**Si, Y.**, Q. Xin, W.F. de Boer, P. Gong, R.C. Ydenberg, and H.H.T. Prins, Do Arctic breeding geese track or overtake a green wave during spring migration? Scientific Reports, 2015. 5: p. 8749. [</w:t>
-      </w:r>
-      <w:proofErr w:type="spellStart"/>
-      <w:r>
-        <w:t>doi</w:t>
-      </w:r>
-      <w:proofErr w:type="spellEnd"/>
-      <w:r>
-        <w:t xml:space="preserve">] (https://doi.org/10.1038/srep08749) </w:t>
+        <w:t xml:space="preserve">**Si, Y.**, Q. Xin, W.F. de Boer, P. Gong, R.C. Ydenberg, and H.H.T. Prins, Do Arctic breeding geese track or overtake a green wave during spring migration? Scientific Reports, 2015. 5: p. 8749. </w:t>
+      </w:r>
+      <w:r>
+        <w:t>[</w:t>
+      </w:r>
+      <w:proofErr w:type="spellStart"/>
+      <w:r>
+        <w:t>doi</w:t>
+      </w:r>
+      <w:proofErr w:type="spellEnd"/>
+      <w:r>
+        <w:t>]</w:t>
+      </w:r>
+      <w:r>
+        <w:t xml:space="preserve">(https://doi.org/10.1038/srep08749) </w:t>
       </w:r>
     </w:p>
     <w:p>
@@ -2236,15 +2476,21 @@
       </w:r>
       <w:r>
         <w:tab/>
-        <w:t>**Si, Y.** and H.H.T. Prins, Climate law: path paved for civil action. Nature, 2015. 523(7561): p. 410. [</w:t>
-      </w:r>
-      <w:proofErr w:type="spellStart"/>
-      <w:r>
-        <w:t>doi</w:t>
-      </w:r>
-      <w:proofErr w:type="spellEnd"/>
-      <w:r>
-        <w:t xml:space="preserve">] (https://doi.org/10.1038/523410e) </w:t>
+        <w:t xml:space="preserve">**Si, Y.** and H.H.T. Prins, Climate law: path paved for civil action. Nature, 2015. 523(7561): p. 410. </w:t>
+      </w:r>
+      <w:r>
+        <w:t>[</w:t>
+      </w:r>
+      <w:proofErr w:type="spellStart"/>
+      <w:r>
+        <w:t>doi</w:t>
+      </w:r>
+      <w:proofErr w:type="spellEnd"/>
+      <w:r>
+        <w:t>]</w:t>
+      </w:r>
+      <w:r>
+        <w:t xml:space="preserve">(https://doi.org/10.1038/523410e) </w:t>
       </w:r>
     </w:p>
     <w:p>
@@ -2253,15 +2499,21 @@
       </w:r>
       <w:r>
         <w:tab/>
-        <w:t>Li, X., N. Clinton, **Y, Si**, J. Liao, L. Liang, and P. Gong, Projected impacts of climate change on protected birds and nature reserves in China. Science Bulletin, 2015: p. 1-10. [</w:t>
-      </w:r>
-      <w:proofErr w:type="spellStart"/>
-      <w:r>
-        <w:t>doi</w:t>
-      </w:r>
-      <w:proofErr w:type="spellEnd"/>
-      <w:r>
-        <w:t xml:space="preserve">] (https://doi.org/10.1007/s11434-015-0892-y) </w:t>
+        <w:t xml:space="preserve">Li, X., N. Clinton, **Y, Si**, J. Liao, L. Liang, and P. Gong, Projected impacts of climate change on protected birds and nature reserves in China. Science Bulletin, 2015: p. 1-10. </w:t>
+      </w:r>
+      <w:r>
+        <w:t>[</w:t>
+      </w:r>
+      <w:proofErr w:type="spellStart"/>
+      <w:r>
+        <w:t>doi</w:t>
+      </w:r>
+      <w:proofErr w:type="spellEnd"/>
+      <w:r>
+        <w:t>]</w:t>
+      </w:r>
+      <w:r>
+        <w:t xml:space="preserve">(https://doi.org/10.1007/s11434-015-0892-y) </w:t>
       </w:r>
     </w:p>
     <w:p/>
@@ -2288,7 +2540,19 @@
         <w:rPr>
           <w:lang w:val="pt-BR"/>
         </w:rPr>
-        <w:t xml:space="preserve">PLoS One, 2013. 8(1): p. e53362. [doi] (https://doi.org/10.1371/journal.pone.0053362) </w:t>
+        <w:t xml:space="preserve">PLoS One, 2013. 8(1): p. e53362. </w:t>
+      </w:r>
+      <w:r>
+        <w:rPr>
+          <w:lang w:val="pt-BR"/>
+        </w:rPr>
+        <w:t>[doi]</w:t>
+      </w:r>
+      <w:r>
+        <w:rPr>
+          <w:lang w:val="pt-BR"/>
+        </w:rPr>
+        <w:t xml:space="preserve">(https://doi.org/10.1371/journal.pone.0053362) </w:t>
       </w:r>
     </w:p>
     <w:p>
@@ -2316,7 +2580,19 @@
         <w:rPr>
           <w:lang w:val="pt-BR"/>
         </w:rPr>
-        <w:t xml:space="preserve">PLoS One, 2013. 8(8): p. e72352. [doi] (https://doi.org/10.1371/journal.pone.0072352) </w:t>
+        <w:t xml:space="preserve">PLoS One, 2013. 8(8): p. e72352. </w:t>
+      </w:r>
+      <w:r>
+        <w:rPr>
+          <w:lang w:val="pt-BR"/>
+        </w:rPr>
+        <w:t>[doi]</w:t>
+      </w:r>
+      <w:r>
+        <w:rPr>
+          <w:lang w:val="pt-BR"/>
+        </w:rPr>
+        <w:t xml:space="preserve">(https://doi.org/10.1371/journal.pone.0072352) </w:t>
       </w:r>
     </w:p>
     <w:p>
@@ -2342,15 +2618,21 @@
       </w:r>
       <w:r>
         <w:lastRenderedPageBreak/>
-        <w:t>Applied Earth Observation and Geoinformation, 2012. 19: p. 196-204. [</w:t>
-      </w:r>
-      <w:proofErr w:type="spellStart"/>
-      <w:r>
-        <w:t>doi</w:t>
-      </w:r>
-      <w:proofErr w:type="spellEnd"/>
-      <w:r>
-        <w:t xml:space="preserve">] (https://doi.org/10.1016/j.jag.2012.05.008) </w:t>
+        <w:t xml:space="preserve">Applied Earth Observation and Geoinformation, 2012. 19: p. 196-204. </w:t>
+      </w:r>
+      <w:r>
+        <w:t>[</w:t>
+      </w:r>
+      <w:proofErr w:type="spellStart"/>
+      <w:r>
+        <w:t>doi</w:t>
+      </w:r>
+      <w:proofErr w:type="spellEnd"/>
+      <w:r>
+        <w:t>]</w:t>
+      </w:r>
+      <w:r>
+        <w:t xml:space="preserve">(https://doi.org/10.1016/j.jag.2012.05.008) </w:t>
       </w:r>
     </w:p>
     <w:p>
@@ -2367,15 +2649,21 @@
       </w:r>
       <w:proofErr w:type="spellEnd"/>
       <w:r>
-        <w:t>-temporal variation of grassland quantity and quality using MERIS data and the PROSAIL model. Remote Sensing of Environment, 2012. 121: p. 415-425. [</w:t>
-      </w:r>
-      <w:proofErr w:type="spellStart"/>
-      <w:r>
-        <w:t>doi</w:t>
-      </w:r>
-      <w:proofErr w:type="spellEnd"/>
-      <w:r>
-        <w:t xml:space="preserve">] (https://doi.org/10.1016/j.rse.2012.02.011) </w:t>
+        <w:t xml:space="preserve">-temporal variation of grassland quantity and quality using MERIS data and the PROSAIL model. Remote Sensing of Environment, 2012. 121: p. 415-425. </w:t>
+      </w:r>
+      <w:r>
+        <w:t>[</w:t>
+      </w:r>
+      <w:proofErr w:type="spellStart"/>
+      <w:r>
+        <w:t>doi</w:t>
+      </w:r>
+      <w:proofErr w:type="spellEnd"/>
+      <w:r>
+        <w:t>]</w:t>
+      </w:r>
+      <w:r>
+        <w:t xml:space="preserve">(https://doi.org/10.1016/j.rse.2012.02.011) </w:t>
       </w:r>
     </w:p>
     <w:p/>
@@ -2439,15 +2727,21 @@
       </w:r>
       <w:proofErr w:type="spellEnd"/>
       <w:r>
-        <w:t>, K.-M. Exo, and H.H.T. Prins, Distribution of Barnacle Geese Branta leucopsis in relation to food resources, distance to roosts, and the location of refuges. Ardea, 2011. 99: p. 217-226. [</w:t>
-      </w:r>
-      <w:proofErr w:type="spellStart"/>
-      <w:r>
-        <w:t>doi</w:t>
-      </w:r>
-      <w:proofErr w:type="spellEnd"/>
-      <w:r>
-        <w:t xml:space="preserve">] (https://doi.org/10.5253/078.099.0212) </w:t>
+        <w:t xml:space="preserve">, K.-M. Exo, and H.H.T. Prins, Distribution of Barnacle Geese Branta leucopsis in relation to food resources, distance to roosts, and the location of refuges. Ardea, 2011. 99: p. 217-226. </w:t>
+      </w:r>
+      <w:r>
+        <w:t>[</w:t>
+      </w:r>
+      <w:proofErr w:type="spellStart"/>
+      <w:r>
+        <w:t>doi</w:t>
+      </w:r>
+      <w:proofErr w:type="spellEnd"/>
+      <w:r>
+        <w:t>]</w:t>
+      </w:r>
+      <w:r>
+        <w:t xml:space="preserve">(https://doi.org/10.5253/078.099.0212) </w:t>
       </w:r>
     </w:p>
     <w:p/>
@@ -2471,15 +2765,21 @@
       </w:r>
       <w:proofErr w:type="spellEnd"/>
       <w:r>
-        <w:t xml:space="preserve"> &amp; Remote Sensing, 2010. 76: p. 1343-1352. [</w:t>
-      </w:r>
-      <w:proofErr w:type="spellStart"/>
-      <w:r>
-        <w:t>doi</w:t>
-      </w:r>
-      <w:proofErr w:type="spellEnd"/>
-      <w:r>
-        <w:t xml:space="preserve">] (https://doi.org/10.14358/PERS.76.12.1343) </w:t>
+        <w:t xml:space="preserve"> &amp; Remote Sensing, 2010. 76: p. 1343-1352. </w:t>
+      </w:r>
+      <w:r>
+        <w:t>[</w:t>
+      </w:r>
+      <w:proofErr w:type="spellStart"/>
+      <w:r>
+        <w:t>doi</w:t>
+      </w:r>
+      <w:proofErr w:type="spellEnd"/>
+      <w:r>
+        <w:t>]</w:t>
+      </w:r>
+      <w:r>
+        <w:t xml:space="preserve">(https://doi.org/10.14358/PERS.76.12.1343) </w:t>
       </w:r>
     </w:p>
     <w:p>
@@ -2488,15 +2788,21 @@
       </w:r>
       <w:r>
         <w:tab/>
-        <w:t>**Si, Y.**, T. Wang, A.K. Skidmore, W.F. de Boer, L. Li, and H.H.T. Prins, Environmental factors influencing the spread of the highly pathogenic avian influenza H5N1 virus in wild birds in Europe. Ecology and Society, 2010. 15(3): p. 26. [</w:t>
-      </w:r>
-      <w:proofErr w:type="spellStart"/>
-      <w:r>
-        <w:t>doi</w:t>
-      </w:r>
-      <w:proofErr w:type="spellEnd"/>
-      <w:r>
-        <w:t xml:space="preserve">] (http://dx.doi.org/10.5751/ES-03622-150326) </w:t>
+        <w:t xml:space="preserve">**Si, Y.**, T. Wang, A.K. Skidmore, W.F. de Boer, L. Li, and H.H.T. Prins, Environmental factors influencing the spread of the highly pathogenic avian influenza H5N1 virus in wild birds in Europe. Ecology and Society, 2010. 15(3): p. 26. </w:t>
+      </w:r>
+      <w:r>
+        <w:t>[</w:t>
+      </w:r>
+      <w:proofErr w:type="spellStart"/>
+      <w:r>
+        <w:t>doi</w:t>
+      </w:r>
+      <w:proofErr w:type="spellEnd"/>
+      <w:r>
+        <w:t>]</w:t>
+      </w:r>
+      <w:r>
+        <w:t xml:space="preserve">(http://dx.doi.org/10.5751/ES-03622-150326) </w:t>
       </w:r>
     </w:p>
     <w:p/>
@@ -2544,15 +2850,21 @@
       </w:r>
       <w:proofErr w:type="spellEnd"/>
       <w:r>
-        <w:t xml:space="preserve"> Health, 2009. 4(1): p. 65-78. [</w:t>
-      </w:r>
-      <w:proofErr w:type="spellStart"/>
-      <w:r>
-        <w:t>doi</w:t>
-      </w:r>
-      <w:proofErr w:type="spellEnd"/>
-      <w:r>
-        <w:t xml:space="preserve">] (https://doi.org/10.4081/gh.2009.211) </w:t>
+        <w:t xml:space="preserve"> Health, 2009. 4(1): p. 65-78. </w:t>
+      </w:r>
+      <w:r>
+        <w:t>[</w:t>
+      </w:r>
+      <w:proofErr w:type="spellStart"/>
+      <w:r>
+        <w:t>doi</w:t>
+      </w:r>
+      <w:proofErr w:type="spellEnd"/>
+      <w:r>
+        <w:t>]</w:t>
+      </w:r>
+      <w:r>
+        <w:t xml:space="preserve">(https://doi.org/10.4081/gh.2009.211) </w:t>
       </w:r>
     </w:p>
     <w:p/>

</xml_diff>